<commit_message>
Make movilidad optional in Contrato Administrativo generation
The admin highlighted their actual template, confirming remuneracion +
movilidad is meant to be a single placeholder in that clause ("S/ 1800
+ 200 de movilidad"), not two separate ones as previously split.
Reprocessed the template against the highlighted version to match it
exactly (same field set, same clean text after removing highlighting).

Movilidad is now optional: leaving the input blank stores it as null
and the generated contract shows just the base remuneracion with no
"+ ... de movilidad" suffix, instead of requiring a value. Also fixes
a real bug this surfaced — saving an empty string into the
contrato_remuneracion_movilidad decimal column threw a cast exception;
it's now normalized to null before saving.

Co-Authored-By: Claude Sonnet 5 <noreply@anthropic.com>
</commit_message>
<xml_diff>
--- a/resources/data/contrato-administrativo-template.docx
+++ b/resources/data/contrato-administrativo-template.docx
@@ -1,6 +1,6 @@
 
 <file path=word/document.xml><?xml version="1.0" encoding="utf-8"?>
-<w:document xmlns:wpc="http://schemas.microsoft.com/office/word/2010/wordprocessingCanvas" xmlns:cx="http://schemas.microsoft.com/office/drawing/2014/chartex" xmlns:cx1="http://schemas.microsoft.com/office/drawing/2015/9/8/chartex" xmlns:cx2="http://schemas.microsoft.com/office/drawing/2015/10/21/chartex" xmlns:cx3="http://schemas.microsoft.com/office/drawing/2016/5/9/chartex" xmlns:cx4="http://schemas.microsoft.com/office/drawing/2016/5/10/chartex" xmlns:cx5="http://schemas.microsoft.com/office/drawing/2016/5/11/chartex" xmlns:cx6="http://schemas.microsoft.com/office/drawing/2016/5/12/chartex" xmlns:cx7="http://schemas.microsoft.com/office/drawing/2016/5/13/chartex" xmlns:cx8="http://schemas.microsoft.com/office/drawing/2016/5/14/chartex" xmlns:mc="http://schemas.openxmlformats.org/markup-compatibility/2006" xmlns:aink="http://schemas.microsoft.com/office/drawing/2016/ink" xmlns:am3d="http://schemas.microsoft.com/office/drawing/2017/model3d" xmlns:o="urn:schemas-microsoft-com:office:office" xmlns:oel="http://schemas.microsoft.com/office/2019/extlst" xmlns:r="http://schemas.openxmlformats.org/officeDocument/2006/relationships" xmlns:m="http://schemas.openxmlformats.org/officeDocument/2006/math" xmlns:v="urn:schemas-microsoft-com:vml" xmlns:wp14="http://schemas.microsoft.com/office/word/2010/wordprocessingDrawing" xmlns:wp="http://schemas.openxmlformats.org/drawingml/2006/wordprocessingDrawing" xmlns:w10="urn:schemas-microsoft-com:office:word" xmlns:w="http://schemas.openxmlformats.org/wordprocessingml/2006/main" xmlns:w14="http://schemas.microsoft.com/office/word/2010/wordml" xmlns:w15="http://schemas.microsoft.com/office/word/2012/wordml" xmlns:w16cex="http://schemas.microsoft.com/office/word/2018/wordml/cex" xmlns:w16cid="http://schemas.microsoft.com/office/word/2016/wordml/cid" xmlns:w16="http://schemas.microsoft.com/office/word/2018/wordml" xmlns:w16du="http://schemas.microsoft.com/office/word/2023/wordml/word16du" xmlns:w16sdtdh="http://schemas.microsoft.com/office/word/2020/wordml/sdtdatahash" xmlns:w16sdtfl="http://schemas.microsoft.com/office/word/2024/wordml/sdtformatlock" xmlns:w16se="http://schemas.microsoft.com/office/word/2015/wordml/symex" xmlns:wpg="http://schemas.microsoft.com/office/word/2010/wordprocessingGroup" xmlns:wpi="http://schemas.microsoft.com/office/word/2010/wordprocessingInk" xmlns:wne="http://schemas.microsoft.com/office/word/2006/wordml" xmlns:wps="http://schemas.microsoft.com/office/word/2010/wordprocessingShape" mc:Ignorable="w14 w15 w16se w16cid w16 w16cex w16sdtdh w16sdtfl w16du wp14">
+<w:document xmlns:wpc="http://schemas.microsoft.com/office/word/2010/wordprocessingCanvas" xmlns:cx="http://schemas.microsoft.com/office/drawing/2014/chartex" xmlns:cx1="http://schemas.microsoft.com/office/drawing/2015/9/8/chartex" xmlns:cx2="http://schemas.microsoft.com/office/drawing/2015/10/21/chartex" xmlns:cx3="http://schemas.microsoft.com/office/drawing/2016/5/9/chartex" xmlns:cx4="http://schemas.microsoft.com/office/drawing/2016/5/10/chartex" xmlns:cx5="http://schemas.microsoft.com/office/drawing/2016/5/11/chartex" xmlns:cx6="http://schemas.microsoft.com/office/drawing/2016/5/12/chartex" xmlns:cx7="http://schemas.microsoft.com/office/drawing/2016/5/13/chartex" xmlns:cx8="http://schemas.microsoft.com/office/drawing/2016/5/14/chartex" xmlns:mc="http://schemas.openxmlformats.org/markup-compatibility/2006" xmlns:aink="http://schemas.microsoft.com/office/drawing/2016/ink" xmlns:am3d="http://schemas.microsoft.com/office/drawing/2017/model3d" xmlns:o="urn:schemas-microsoft-com:office:office" xmlns:oel="http://schemas.microsoft.com/office/2019/extlst" xmlns:r="http://schemas.openxmlformats.org/officeDocument/2006/relationships" xmlns:m="http://schemas.openxmlformats.org/officeDocument/2006/math" xmlns:v="urn:schemas-microsoft-com:vml" xmlns:wp14="http://schemas.microsoft.com/office/word/2010/wordprocessingDrawing" xmlns:wp="http://schemas.openxmlformats.org/drawingml/2006/wordprocessingDrawing" xmlns:w10="urn:schemas-microsoft-com:office:word" xmlns:w="http://schemas.openxmlformats.org/wordprocessingml/2006/main" xmlns:w14="http://schemas.microsoft.com/office/word/2010/wordml" xmlns:w15="http://schemas.microsoft.com/office/word/2012/wordml" xmlns:w16cex="http://schemas.microsoft.com/office/word/2018/wordml/cex" xmlns:w16cid="http://schemas.microsoft.com/office/word/2016/wordml/cid" xmlns:w16="http://schemas.microsoft.com/office/word/2018/wordml" xmlns:w16du="http://schemas.microsoft.com/office/word/2023/wordml/word16du" xmlns:w16sdtdh="http://schemas.microsoft.com/office/word/2020/wordml/sdtdatahash" xmlns:w16se="http://schemas.microsoft.com/office/word/2015/wordml/symex" xmlns:wpg="http://schemas.microsoft.com/office/word/2010/wordprocessingGroup" xmlns:wpi="http://schemas.microsoft.com/office/word/2010/wordprocessingInk" xmlns:wne="http://schemas.microsoft.com/office/word/2006/wordml" xmlns:wps="http://schemas.microsoft.com/office/word/2010/wordprocessingShape" mc:Ignorable="w14 w15 w16se w16cid w16 w16cex w16sdtdh wp14">
   <w:body>
     <w:p>
       <w:pPr>
@@ -44,36 +44,75 @@
           <w:sz w:val="20"/>
           <w:szCs w:val="20"/>
         </w:rPr>
-        <w:t xml:space="preserve">Consta por el presente documento por duplicado, el contrato de trabajo sujeto a modalidad por incremento de actividad que celebran, de una parte, B2 SOLUTIONS E.I.R.L., con RUC 20614231646, domiciliada en Av. Rivera Navarrete 788, San Isidro, Lima, debidamente representada por su Gerente General, Srta. CERDAN CABRERA CHIRLEY MILAGROS, con DNI 71114961, mediante poder inscrito en la Partida N.° 15910923 de los Registros Públicos, a quien en adelante se le denominará EL EMPLEADOR; y, de la otra parte, ${NOMBRE_TRABAJADOR}, identificado(a) con DNI N.°</w:t>
-      </w:r>
-      <w:r>
+        <w:t xml:space="preserve">Consta por el presente documento por duplicado, el contrato de trabajo sujeto a modalidad por incremento de actividad que celebran, de una parte, B2 SOLUTIONS E.I.R.L., con RUC 20614231646, domiciliada en Av. Rivera Navarrete 788, San Isidro, Lima, debidamente representada por su Gerente General, Srta. CERDAN CABRERA CHIRLEY MILAGROS, con DNI 71114961, mediante poder inscrito en la Partida N.° 15910923 de los Registros Públicos, a quien en adelante se le denominará EL EMPLEADOR; y, de la otra parte, </w:t>
+      </w:r>
+      <w:r>
+        <w:rPr/>
+        <w:t>${NOMBRE_TRABAJADOR}</w:t>
+      </w:r>
+      <w:r>
+        <w:rPr>
+          <w:rFonts w:ascii="Arial" w:hAnsi="Arial" w:cs="Arial"/>
+          <w:sz w:val="20"/>
+          <w:szCs w:val="20"/>
+        </w:rPr>
+        <w:t>, identificado(a) con DNI N</w:t>
+      </w:r>
+      <w:r>
+        <w:rPr>
+          <w:rFonts w:ascii="Arial" w:hAnsi="Arial" w:cs="Arial"/>
+          <w:sz w:val="20"/>
+          <w:szCs w:val="20"/>
+        </w:rPr>
+        <w:t>.°</w:t>
+      </w:r>
+      <w:r>
+        <w:rPr/>
+        <w:t xml:space="preserve"> ${DNI_TRABAJADOR}</w:t>
+      </w:r>
+      <w:r>
+        <w:rPr>
+          <w:rFonts w:ascii="Arial" w:hAnsi="Arial" w:cs="Arial"/>
+          <w:sz w:val="20"/>
+          <w:szCs w:val="20"/>
+        </w:rPr>
+        <w:t xml:space="preserve">, con domicilio en</w:t>
+      </w:r>
+      <w:r>
+        <w:rPr>
+          <w:rFonts w:ascii="Arial" w:hAnsi="Arial" w:cs="Arial"/>
+          <w:color w:val="242424"/>
+          <w:sz w:val="20"/>
+          <w:szCs w:val="20"/>
+          <w:shd w:val="clear" w:color="auto" w:fill="FFFFFF"/>
+        </w:rPr>
         <w:t xml:space="preserve"> </w:t>
       </w:r>
       <w:r>
         <w:rPr>
           <w:rFonts w:ascii="Arial" w:hAnsi="Arial" w:cs="Arial"/>
-          <w:sz w:val="20"/>
-          <w:szCs w:val="20"/>
-        </w:rPr>
-        <w:t xml:space="preserve">${DNI_TRABAJADOR}, con domicilio en</w:t>
-      </w:r>
-      <w:r>
-        <w:rPr>
-          <w:rFonts w:ascii="Arial" w:hAnsi="Arial" w:cs="Arial"/>
           <w:color w:val="242424"/>
           <w:sz w:val="20"/>
           <w:szCs w:val="20"/>
           <w:shd w:val="clear" w:color="auto" w:fill="FFFFFF"/>
         </w:rPr>
-        <w:t xml:space="preserve"> ${DIRECCION_TRABAJADOR}</w:t>
-      </w:r>
-      <w:r>
-        <w:rPr>
-          <w:rFonts w:ascii="Arial" w:hAnsi="Arial" w:cs="Arial"/>
-          <w:sz w:val="20"/>
-          <w:szCs w:val="20"/>
-        </w:rPr>
-        <w:t xml:space="preserve">, a quien en adelante se le denominará EL TRABAJADOR, bajo los términos y condiciones siguientes:</w:t>
+        <w:t>${DIRECCION_TRABAJADOR}</w:t>
+      </w:r>
+      <w:r>
+        <w:rPr>
+          <w:rFonts w:ascii="Arial" w:hAnsi="Arial" w:cs="Arial"/>
+          <w:sz w:val="20"/>
+          <w:szCs w:val="20"/>
+        </w:rPr>
+        <w:t>,</w:t>
+      </w:r>
+      <w:r>
+        <w:rPr>
+          <w:rFonts w:ascii="Arial" w:hAnsi="Arial" w:cs="Arial"/>
+          <w:sz w:val="20"/>
+          <w:szCs w:val="20"/>
+        </w:rPr>
+        <w:t xml:space="preserve"> a quien en adelante se le denominará EL TRABAJADOR, bajo los términos y condiciones siguientes:</w:t>
       </w:r>
     </w:p>
     <w:bookmarkEnd w:id="0"/>
@@ -259,7 +298,23 @@
           <w:sz w:val="20"/>
           <w:szCs w:val="20"/>
         </w:rPr>
-        <w:t xml:space="preserve"> Por el presente contrato el TRABAJADOR se obliga a prestar sus servicios al EMPLEADOR para realizar las siguientes actividades como ${PUESTO_TRABAJADOR} destacada en Avenida Rivera Navarrete 788 - San Isidro, debiendo someterse al cumplimiento estricto para la labor al cual ha sido contratado bajo las directivas que emanen de sus jefes o directores caso contrario.</w:t>
+        <w:t xml:space="preserve"> Por el presente contrato el TRABAJADOR se obliga a prestar sus servicios al EMPLEADOR para realizar las siguientes actividades como </w:t>
+      </w:r>
+      <w:r>
+        <w:rPr>
+          <w:rFonts w:ascii="Arial" w:hAnsi="Arial" w:cs="Arial"/>
+          <w:sz w:val="20"/>
+          <w:szCs w:val="20"/>
+        </w:rPr>
+        <w:t>${PUESTO_TRABAJADOR}</w:t>
+      </w:r>
+      <w:r>
+        <w:rPr>
+          <w:rFonts w:ascii="Arial" w:hAnsi="Arial" w:cs="Arial"/>
+          <w:sz w:val="20"/>
+          <w:szCs w:val="20"/>
+        </w:rPr>
+        <w:t xml:space="preserve"> destacada en Avenida Rivera Navarrete 788 - San Isidro, debiendo someterse al cumplimiento estricto para la labor al cual ha sido contratado bajo las directivas que emanen de sus jefes o directores caso contrario.</w:t>
       </w:r>
     </w:p>
     <w:p>
@@ -337,7 +392,15 @@
           <w:sz w:val="20"/>
           <w:szCs w:val="20"/>
         </w:rPr>
-        <w:t xml:space="preserve"> La duración del contrato es de ${DURACION_CONTRATO} a partir de ${FECHA_INICIO_CONTRATO} al ${FECHA_FIN_CONTRATO}.</w:t>
+        <w:t xml:space="preserve"> La duración del contrato es </w:t>
+      </w:r>
+      <w:r>
+        <w:rPr>
+          <w:rFonts w:ascii="Arial" w:hAnsi="Arial" w:cs="Arial"/>
+          <w:sz w:val="20"/>
+          <w:szCs w:val="20"/>
+        </w:rPr>
+        <w:t xml:space="preserve">de ${DURACION_CONTRATO} a partir de ${FECHA_INICIO_CONTRATO} al ${FECHA_FIN_CONTRATO}.</w:t>
       </w:r>
     </w:p>
     <w:p>
@@ -377,7 +440,23 @@
           <w:sz w:val="20"/>
           <w:szCs w:val="20"/>
         </w:rPr>
-        <w:t xml:space="preserve"> En contraprestación a los servicios del TRABAJADOR el EMPLEADOR se obliga a pagar una remuneración mensual de ${REMUNERACION_BASE} + ${REMUNERACION_MOVILIDAD} igualmente se obliga a facilitar al trabajador los materiales para que desarrolle sus actividades.</w:t>
+        <w:t xml:space="preserve"> En contraprestación a los servicios del TRABAJADOR el EMPLEADOR se obliga a pagar una remuneración mensual de </w:t>
+      </w:r>
+      <w:r>
+        <w:rPr>
+          <w:rFonts w:ascii="Arial" w:hAnsi="Arial" w:cs="Arial"/>
+          <w:sz w:val="20"/>
+          <w:szCs w:val="20"/>
+        </w:rPr>
+        <w:t xml:space="preserve">${REMUNERACION}</w:t>
+      </w:r>
+      <w:r>
+        <w:rPr>
+          <w:rFonts w:ascii="Arial" w:hAnsi="Arial" w:cs="Arial"/>
+          <w:sz w:val="20"/>
+          <w:szCs w:val="20"/>
+        </w:rPr>
+        <w:t xml:space="preserve"> igualmente se obliga a facilitar al trabajador los materiales para que desarrolle sus actividades.</w:t>
       </w:r>
     </w:p>
     <w:p>
@@ -1126,7 +1205,15 @@
           <w:sz w:val="20"/>
           <w:szCs w:val="20"/>
         </w:rPr>
-        <w:t xml:space="preserve">Como muestra de conformidad con todas las cláusulas del presente contrato firman las partes, por duplicado el ${FECHA_FIRMA_CONTRATO}.</w:t>
+        <w:t xml:space="preserve">Como muestra de conformidad con todas las cláusulas del presente contrato firman las partes, por duplicado el </w:t>
+      </w:r>
+      <w:r>
+        <w:rPr>
+          <w:rFonts w:ascii="Arial" w:hAnsi="Arial" w:cs="Arial"/>
+          <w:sz w:val="20"/>
+          <w:szCs w:val="20"/>
+        </w:rPr>
+        <w:t xml:space="preserve">${FECHA_FIRMA_CONTRATO}.</w:t>
       </w:r>
     </w:p>
     <w:p>
@@ -1139,7 +1226,7 @@
           <w:noProof/>
         </w:rPr>
         <w:drawing>
-          <wp:anchor distT="0" distB="0" distL="114300" distR="114300" simplePos="0" relativeHeight="251657728" behindDoc="0" locked="0" layoutInCell="1" allowOverlap="1" wp14:anchorId="02E00901" wp14:editId="052861A6">
+          <wp:anchor distT="0" distB="0" distL="114300" distR="114300" simplePos="0" relativeHeight="251657728" behindDoc="0" locked="0" layoutInCell="1" allowOverlap="1" wp14:anchorId="568C3839" wp14:editId="7D24737B">
             <wp:simplePos x="0" y="0"/>
             <wp:positionH relativeFrom="column">
               <wp:posOffset>3543300</wp:posOffset>
@@ -1213,20 +1300,20 @@
         <w:spacing w:after="0" w:line="360" w:lineRule="auto"/>
         <w:jc w:val="both"/>
       </w:pPr>
-    </w:p>
-    <w:p>
-      <w:pPr>
-        <w:spacing w:after="0" w:line="360" w:lineRule="auto"/>
-        <w:jc w:val="both"/>
-      </w:pPr>
-    </w:p>
-    <w:p>
-      <w:pPr>
-        <w:spacing w:after="0" w:line="360" w:lineRule="auto"/>
-        <w:jc w:val="both"/>
-      </w:pPr>
       <w:r>
         <w:t xml:space="preserve">____________________________                                                   </w:t>
+      </w:r>
+    </w:p>
+    <w:p>
+      <w:pPr>
+        <w:spacing w:line="240" w:lineRule="atLeast"/>
+        <w:ind w:left="-709" w:right="140" w:firstLine="709"/>
+        <w:contextualSpacing/>
+        <w:rPr/>
+      </w:pPr>
+      <w:r>
+        <w:rPr/>
+        <w:t>${NOMBRE_TRABAJADOR}</w:t>
       </w:r>
     </w:p>
     <w:p>
@@ -1236,37 +1323,11 @@
         <w:contextualSpacing/>
       </w:pPr>
       <w:r>
-        <w:t xml:space="preserve">             </w:t>
-      </w:r>
-      <w:r>
-        <w:rPr>
-          <w:rFonts w:ascii="Arial" w:hAnsi="Arial" w:cs="Arial"/>
-          <w:sz w:val="20"/>
-          <w:szCs w:val="20"/>
-        </w:rPr>
-        <w:t>${NOMBRE_TRABAJADOR}</w:t>
-      </w:r>
-    </w:p>
-    <w:p>
-      <w:pPr>
-        <w:spacing w:line="240" w:lineRule="atLeast"/>
-        <w:ind w:left="-709" w:right="140"/>
-        <w:contextualSpacing/>
-      </w:pPr>
-      <w:r>
-        <w:lastRenderedPageBreak/>
-        <w:t xml:space="preserve">                         DNI. </w:t>
-      </w:r>
-      <w:r>
-        <w:rPr>
-          <w:rFonts w:ascii="Arial" w:hAnsi="Arial" w:cs="Arial"/>
-          <w:sz w:val="20"/>
-          <w:szCs w:val="20"/>
-        </w:rPr>
-        <w:t>${DNI_TRABAJADOR}</w:t>
-      </w:r>
-      <w:r>
-        <w:t xml:space="preserve">                                                                                 </w:t>
+        <w:rPr/>
+        <w:t xml:space="preserve">                         DNI. ${DNI_TRABAJADOR}</w:t>
+      </w:r>
+      <w:r>
+        <w:t xml:space="preserve">                                                                             </w:t>
       </w:r>
     </w:p>
     <w:sectPr>
@@ -1281,7 +1342,7 @@
 </file>
 
 <file path=word/endnotes.xml><?xml version="1.0" encoding="utf-8"?>
-<w:endnotes xmlns:wpc="http://schemas.microsoft.com/office/word/2010/wordprocessingCanvas" xmlns:cx="http://schemas.microsoft.com/office/drawing/2014/chartex" xmlns:cx1="http://schemas.microsoft.com/office/drawing/2015/9/8/chartex" xmlns:cx2="http://schemas.microsoft.com/office/drawing/2015/10/21/chartex" xmlns:cx3="http://schemas.microsoft.com/office/drawing/2016/5/9/chartex" xmlns:cx4="http://schemas.microsoft.com/office/drawing/2016/5/10/chartex" xmlns:cx5="http://schemas.microsoft.com/office/drawing/2016/5/11/chartex" xmlns:cx6="http://schemas.microsoft.com/office/drawing/2016/5/12/chartex" xmlns:cx7="http://schemas.microsoft.com/office/drawing/2016/5/13/chartex" xmlns:cx8="http://schemas.microsoft.com/office/drawing/2016/5/14/chartex" xmlns:mc="http://schemas.openxmlformats.org/markup-compatibility/2006" xmlns:aink="http://schemas.microsoft.com/office/drawing/2016/ink" xmlns:am3d="http://schemas.microsoft.com/office/drawing/2017/model3d" xmlns:o="urn:schemas-microsoft-com:office:office" xmlns:oel="http://schemas.microsoft.com/office/2019/extlst" xmlns:r="http://schemas.openxmlformats.org/officeDocument/2006/relationships" xmlns:m="http://schemas.openxmlformats.org/officeDocument/2006/math" xmlns:v="urn:schemas-microsoft-com:vml" xmlns:wp14="http://schemas.microsoft.com/office/word/2010/wordprocessingDrawing" xmlns:wp="http://schemas.openxmlformats.org/drawingml/2006/wordprocessingDrawing" xmlns:w10="urn:schemas-microsoft-com:office:word" xmlns:w="http://schemas.openxmlformats.org/wordprocessingml/2006/main" xmlns:w14="http://schemas.microsoft.com/office/word/2010/wordml" xmlns:w15="http://schemas.microsoft.com/office/word/2012/wordml" xmlns:w16cex="http://schemas.microsoft.com/office/word/2018/wordml/cex" xmlns:w16cid="http://schemas.microsoft.com/office/word/2016/wordml/cid" xmlns:w16="http://schemas.microsoft.com/office/word/2018/wordml" xmlns:w16du="http://schemas.microsoft.com/office/word/2023/wordml/word16du" xmlns:w16sdtdh="http://schemas.microsoft.com/office/word/2020/wordml/sdtdatahash" xmlns:w16sdtfl="http://schemas.microsoft.com/office/word/2024/wordml/sdtformatlock" xmlns:w16se="http://schemas.microsoft.com/office/word/2015/wordml/symex" xmlns:wpg="http://schemas.microsoft.com/office/word/2010/wordprocessingGroup" xmlns:wpi="http://schemas.microsoft.com/office/word/2010/wordprocessingInk" xmlns:wne="http://schemas.microsoft.com/office/word/2006/wordml" xmlns:wps="http://schemas.microsoft.com/office/word/2010/wordprocessingShape" mc:Ignorable="w14 w15 w16se w16cid w16 w16cex w16sdtdh w16sdtfl w16du wp14">
+<w:endnotes xmlns:wpc="http://schemas.microsoft.com/office/word/2010/wordprocessingCanvas" xmlns:cx="http://schemas.microsoft.com/office/drawing/2014/chartex" xmlns:cx1="http://schemas.microsoft.com/office/drawing/2015/9/8/chartex" xmlns:cx2="http://schemas.microsoft.com/office/drawing/2015/10/21/chartex" xmlns:cx3="http://schemas.microsoft.com/office/drawing/2016/5/9/chartex" xmlns:cx4="http://schemas.microsoft.com/office/drawing/2016/5/10/chartex" xmlns:cx5="http://schemas.microsoft.com/office/drawing/2016/5/11/chartex" xmlns:cx6="http://schemas.microsoft.com/office/drawing/2016/5/12/chartex" xmlns:cx7="http://schemas.microsoft.com/office/drawing/2016/5/13/chartex" xmlns:cx8="http://schemas.microsoft.com/office/drawing/2016/5/14/chartex" xmlns:mc="http://schemas.openxmlformats.org/markup-compatibility/2006" xmlns:aink="http://schemas.microsoft.com/office/drawing/2016/ink" xmlns:am3d="http://schemas.microsoft.com/office/drawing/2017/model3d" xmlns:o="urn:schemas-microsoft-com:office:office" xmlns:oel="http://schemas.microsoft.com/office/2019/extlst" xmlns:r="http://schemas.openxmlformats.org/officeDocument/2006/relationships" xmlns:m="http://schemas.openxmlformats.org/officeDocument/2006/math" xmlns:v="urn:schemas-microsoft-com:vml" xmlns:wp14="http://schemas.microsoft.com/office/word/2010/wordprocessingDrawing" xmlns:wp="http://schemas.openxmlformats.org/drawingml/2006/wordprocessingDrawing" xmlns:w10="urn:schemas-microsoft-com:office:word" xmlns:w="http://schemas.openxmlformats.org/wordprocessingml/2006/main" xmlns:w14="http://schemas.microsoft.com/office/word/2010/wordml" xmlns:w15="http://schemas.microsoft.com/office/word/2012/wordml" xmlns:w16cex="http://schemas.microsoft.com/office/word/2018/wordml/cex" xmlns:w16cid="http://schemas.microsoft.com/office/word/2016/wordml/cid" xmlns:w16="http://schemas.microsoft.com/office/word/2018/wordml" xmlns:w16du="http://schemas.microsoft.com/office/word/2023/wordml/word16du" xmlns:w16sdtdh="http://schemas.microsoft.com/office/word/2020/wordml/sdtdatahash" xmlns:w16se="http://schemas.microsoft.com/office/word/2015/wordml/symex" xmlns:wpg="http://schemas.microsoft.com/office/word/2010/wordprocessingGroup" xmlns:wpi="http://schemas.microsoft.com/office/word/2010/wordprocessingInk" xmlns:wne="http://schemas.microsoft.com/office/word/2006/wordml" xmlns:wps="http://schemas.microsoft.com/office/word/2010/wordprocessingShape" mc:Ignorable="w14 w15 w16se w16cid w16 w16cex w16sdtdh wp14">
   <w:endnote w:type="separator" w:id="-1">
     <w:p>
       <w:pPr>
@@ -1306,7 +1367,7 @@
 </file>
 
 <file path=word/footnotes.xml><?xml version="1.0" encoding="utf-8"?>
-<w:footnotes xmlns:wpc="http://schemas.microsoft.com/office/word/2010/wordprocessingCanvas" xmlns:cx="http://schemas.microsoft.com/office/drawing/2014/chartex" xmlns:cx1="http://schemas.microsoft.com/office/drawing/2015/9/8/chartex" xmlns:cx2="http://schemas.microsoft.com/office/drawing/2015/10/21/chartex" xmlns:cx3="http://schemas.microsoft.com/office/drawing/2016/5/9/chartex" xmlns:cx4="http://schemas.microsoft.com/office/drawing/2016/5/10/chartex" xmlns:cx5="http://schemas.microsoft.com/office/drawing/2016/5/11/chartex" xmlns:cx6="http://schemas.microsoft.com/office/drawing/2016/5/12/chartex" xmlns:cx7="http://schemas.microsoft.com/office/drawing/2016/5/13/chartex" xmlns:cx8="http://schemas.microsoft.com/office/drawing/2016/5/14/chartex" xmlns:mc="http://schemas.openxmlformats.org/markup-compatibility/2006" xmlns:aink="http://schemas.microsoft.com/office/drawing/2016/ink" xmlns:am3d="http://schemas.microsoft.com/office/drawing/2017/model3d" xmlns:o="urn:schemas-microsoft-com:office:office" xmlns:oel="http://schemas.microsoft.com/office/2019/extlst" xmlns:r="http://schemas.openxmlformats.org/officeDocument/2006/relationships" xmlns:m="http://schemas.openxmlformats.org/officeDocument/2006/math" xmlns:v="urn:schemas-microsoft-com:vml" xmlns:wp14="http://schemas.microsoft.com/office/word/2010/wordprocessingDrawing" xmlns:wp="http://schemas.openxmlformats.org/drawingml/2006/wordprocessingDrawing" xmlns:w10="urn:schemas-microsoft-com:office:word" xmlns:w="http://schemas.openxmlformats.org/wordprocessingml/2006/main" xmlns:w14="http://schemas.microsoft.com/office/word/2010/wordml" xmlns:w15="http://schemas.microsoft.com/office/word/2012/wordml" xmlns:w16cex="http://schemas.microsoft.com/office/word/2018/wordml/cex" xmlns:w16cid="http://schemas.microsoft.com/office/word/2016/wordml/cid" xmlns:w16="http://schemas.microsoft.com/office/word/2018/wordml" xmlns:w16du="http://schemas.microsoft.com/office/word/2023/wordml/word16du" xmlns:w16sdtdh="http://schemas.microsoft.com/office/word/2020/wordml/sdtdatahash" xmlns:w16sdtfl="http://schemas.microsoft.com/office/word/2024/wordml/sdtformatlock" xmlns:w16se="http://schemas.microsoft.com/office/word/2015/wordml/symex" xmlns:wpg="http://schemas.microsoft.com/office/word/2010/wordprocessingGroup" xmlns:wpi="http://schemas.microsoft.com/office/word/2010/wordprocessingInk" xmlns:wne="http://schemas.microsoft.com/office/word/2006/wordml" xmlns:wps="http://schemas.microsoft.com/office/word/2010/wordprocessingShape" mc:Ignorable="w14 w15 w16se w16cid w16 w16cex w16sdtdh w16sdtfl w16du wp14">
+<w:footnotes xmlns:wpc="http://schemas.microsoft.com/office/word/2010/wordprocessingCanvas" xmlns:cx="http://schemas.microsoft.com/office/drawing/2014/chartex" xmlns:cx1="http://schemas.microsoft.com/office/drawing/2015/9/8/chartex" xmlns:cx2="http://schemas.microsoft.com/office/drawing/2015/10/21/chartex" xmlns:cx3="http://schemas.microsoft.com/office/drawing/2016/5/9/chartex" xmlns:cx4="http://schemas.microsoft.com/office/drawing/2016/5/10/chartex" xmlns:cx5="http://schemas.microsoft.com/office/drawing/2016/5/11/chartex" xmlns:cx6="http://schemas.microsoft.com/office/drawing/2016/5/12/chartex" xmlns:cx7="http://schemas.microsoft.com/office/drawing/2016/5/13/chartex" xmlns:cx8="http://schemas.microsoft.com/office/drawing/2016/5/14/chartex" xmlns:mc="http://schemas.openxmlformats.org/markup-compatibility/2006" xmlns:aink="http://schemas.microsoft.com/office/drawing/2016/ink" xmlns:am3d="http://schemas.microsoft.com/office/drawing/2017/model3d" xmlns:o="urn:schemas-microsoft-com:office:office" xmlns:oel="http://schemas.microsoft.com/office/2019/extlst" xmlns:r="http://schemas.openxmlformats.org/officeDocument/2006/relationships" xmlns:m="http://schemas.openxmlformats.org/officeDocument/2006/math" xmlns:v="urn:schemas-microsoft-com:vml" xmlns:wp14="http://schemas.microsoft.com/office/word/2010/wordprocessingDrawing" xmlns:wp="http://schemas.openxmlformats.org/drawingml/2006/wordprocessingDrawing" xmlns:w10="urn:schemas-microsoft-com:office:word" xmlns:w="http://schemas.openxmlformats.org/wordprocessingml/2006/main" xmlns:w14="http://schemas.microsoft.com/office/word/2010/wordml" xmlns:w15="http://schemas.microsoft.com/office/word/2012/wordml" xmlns:w16cex="http://schemas.microsoft.com/office/word/2018/wordml/cex" xmlns:w16cid="http://schemas.microsoft.com/office/word/2016/wordml/cid" xmlns:w16="http://schemas.microsoft.com/office/word/2018/wordml" xmlns:w16du="http://schemas.microsoft.com/office/word/2023/wordml/word16du" xmlns:w16sdtdh="http://schemas.microsoft.com/office/word/2020/wordml/sdtdatahash" xmlns:w16se="http://schemas.microsoft.com/office/word/2015/wordml/symex" xmlns:wpg="http://schemas.microsoft.com/office/word/2010/wordprocessingGroup" xmlns:wpi="http://schemas.microsoft.com/office/word/2010/wordprocessingInk" xmlns:wne="http://schemas.microsoft.com/office/word/2006/wordml" xmlns:wps="http://schemas.microsoft.com/office/word/2010/wordprocessingShape" mc:Ignorable="w14 w15 w16se w16cid w16 w16cex w16sdtdh wp14">
   <w:footnote w:type="separator" w:id="-1">
     <w:p>
       <w:pPr>
@@ -1331,7 +1392,7 @@
 </file>
 
 <file path=word/header1.xml><?xml version="1.0" encoding="utf-8"?>
-<w:hdr xmlns:wpc="http://schemas.microsoft.com/office/word/2010/wordprocessingCanvas" xmlns:cx="http://schemas.microsoft.com/office/drawing/2014/chartex" xmlns:cx1="http://schemas.microsoft.com/office/drawing/2015/9/8/chartex" xmlns:cx2="http://schemas.microsoft.com/office/drawing/2015/10/21/chartex" xmlns:cx3="http://schemas.microsoft.com/office/drawing/2016/5/9/chartex" xmlns:cx4="http://schemas.microsoft.com/office/drawing/2016/5/10/chartex" xmlns:cx5="http://schemas.microsoft.com/office/drawing/2016/5/11/chartex" xmlns:cx6="http://schemas.microsoft.com/office/drawing/2016/5/12/chartex" xmlns:cx7="http://schemas.microsoft.com/office/drawing/2016/5/13/chartex" xmlns:cx8="http://schemas.microsoft.com/office/drawing/2016/5/14/chartex" xmlns:mc="http://schemas.openxmlformats.org/markup-compatibility/2006" xmlns:aink="http://schemas.microsoft.com/office/drawing/2016/ink" xmlns:am3d="http://schemas.microsoft.com/office/drawing/2017/model3d" xmlns:o="urn:schemas-microsoft-com:office:office" xmlns:oel="http://schemas.microsoft.com/office/2019/extlst" xmlns:r="http://schemas.openxmlformats.org/officeDocument/2006/relationships" xmlns:m="http://schemas.openxmlformats.org/officeDocument/2006/math" xmlns:v="urn:schemas-microsoft-com:vml" xmlns:wp14="http://schemas.microsoft.com/office/word/2010/wordprocessingDrawing" xmlns:wp="http://schemas.openxmlformats.org/drawingml/2006/wordprocessingDrawing" xmlns:w10="urn:schemas-microsoft-com:office:word" xmlns:w="http://schemas.openxmlformats.org/wordprocessingml/2006/main" xmlns:w14="http://schemas.microsoft.com/office/word/2010/wordml" xmlns:w15="http://schemas.microsoft.com/office/word/2012/wordml" xmlns:w16cex="http://schemas.microsoft.com/office/word/2018/wordml/cex" xmlns:w16cid="http://schemas.microsoft.com/office/word/2016/wordml/cid" xmlns:w16="http://schemas.microsoft.com/office/word/2018/wordml" xmlns:w16du="http://schemas.microsoft.com/office/word/2023/wordml/word16du" xmlns:w16sdtdh="http://schemas.microsoft.com/office/word/2020/wordml/sdtdatahash" xmlns:w16sdtfl="http://schemas.microsoft.com/office/word/2024/wordml/sdtformatlock" xmlns:w16se="http://schemas.microsoft.com/office/word/2015/wordml/symex" xmlns:wpg="http://schemas.microsoft.com/office/word/2010/wordprocessingGroup" xmlns:wpi="http://schemas.microsoft.com/office/word/2010/wordprocessingInk" xmlns:wne="http://schemas.microsoft.com/office/word/2006/wordml" xmlns:wps="http://schemas.microsoft.com/office/word/2010/wordprocessingShape" mc:Ignorable="w14 w15 w16se w16cid w16 w16cex w16sdtdh w16sdtfl w16du wp14">
+<w:hdr xmlns:wpc="http://schemas.microsoft.com/office/word/2010/wordprocessingCanvas" xmlns:cx="http://schemas.microsoft.com/office/drawing/2014/chartex" xmlns:cx1="http://schemas.microsoft.com/office/drawing/2015/9/8/chartex" xmlns:cx2="http://schemas.microsoft.com/office/drawing/2015/10/21/chartex" xmlns:cx3="http://schemas.microsoft.com/office/drawing/2016/5/9/chartex" xmlns:cx4="http://schemas.microsoft.com/office/drawing/2016/5/10/chartex" xmlns:cx5="http://schemas.microsoft.com/office/drawing/2016/5/11/chartex" xmlns:cx6="http://schemas.microsoft.com/office/drawing/2016/5/12/chartex" xmlns:cx7="http://schemas.microsoft.com/office/drawing/2016/5/13/chartex" xmlns:cx8="http://schemas.microsoft.com/office/drawing/2016/5/14/chartex" xmlns:mc="http://schemas.openxmlformats.org/markup-compatibility/2006" xmlns:aink="http://schemas.microsoft.com/office/drawing/2016/ink" xmlns:am3d="http://schemas.microsoft.com/office/drawing/2017/model3d" xmlns:o="urn:schemas-microsoft-com:office:office" xmlns:oel="http://schemas.microsoft.com/office/2019/extlst" xmlns:r="http://schemas.openxmlformats.org/officeDocument/2006/relationships" xmlns:m="http://schemas.openxmlformats.org/officeDocument/2006/math" xmlns:v="urn:schemas-microsoft-com:vml" xmlns:wp14="http://schemas.microsoft.com/office/word/2010/wordprocessingDrawing" xmlns:wp="http://schemas.openxmlformats.org/drawingml/2006/wordprocessingDrawing" xmlns:w10="urn:schemas-microsoft-com:office:word" xmlns:w="http://schemas.openxmlformats.org/wordprocessingml/2006/main" xmlns:w14="http://schemas.microsoft.com/office/word/2010/wordml" xmlns:w15="http://schemas.microsoft.com/office/word/2012/wordml" xmlns:w16cex="http://schemas.microsoft.com/office/word/2018/wordml/cex" xmlns:w16cid="http://schemas.microsoft.com/office/word/2016/wordml/cid" xmlns:w16="http://schemas.microsoft.com/office/word/2018/wordml" xmlns:w16du="http://schemas.microsoft.com/office/word/2023/wordml/word16du" xmlns:w16sdtdh="http://schemas.microsoft.com/office/word/2020/wordml/sdtdatahash" xmlns:w16se="http://schemas.microsoft.com/office/word/2015/wordml/symex" xmlns:wpg="http://schemas.microsoft.com/office/word/2010/wordprocessingGroup" xmlns:wpi="http://schemas.microsoft.com/office/word/2010/wordprocessingInk" xmlns:wne="http://schemas.microsoft.com/office/word/2006/wordml" xmlns:wps="http://schemas.microsoft.com/office/word/2010/wordprocessingShape" mc:Ignorable="w14 w15 w16se w16cid w16 w16cex w16sdtdh wp14">
   <w:p>
     <w:pPr>
       <w:pStyle w:val="Encabezado"/>
@@ -1341,7 +1402,7 @@
         <w:noProof/>
       </w:rPr>
       <w:drawing>
-        <wp:anchor distT="0" distB="0" distL="114300" distR="114300" simplePos="0" relativeHeight="251657728" behindDoc="0" locked="0" layoutInCell="1" allowOverlap="1" wp14:anchorId="0A80EBBC" wp14:editId="2AA9E88B">
+        <wp:anchor distT="0" distB="0" distL="114300" distR="114300" simplePos="0" relativeHeight="251657728" behindDoc="0" locked="0" layoutInCell="1" allowOverlap="1" wp14:anchorId="2C1BFB40" wp14:editId="7110609C">
           <wp:simplePos x="0" y="0"/>
           <wp:positionH relativeFrom="column">
             <wp:posOffset>-270510</wp:posOffset>
@@ -1408,7 +1469,7 @@
 </file>
 
 <file path=word/styles.xml><?xml version="1.0" encoding="utf-8"?>
-<w:styles xmlns:mc="http://schemas.openxmlformats.org/markup-compatibility/2006" xmlns:r="http://schemas.openxmlformats.org/officeDocument/2006/relationships" xmlns:w="http://schemas.openxmlformats.org/wordprocessingml/2006/main" xmlns:w14="http://schemas.microsoft.com/office/word/2010/wordml" xmlns:w15="http://schemas.microsoft.com/office/word/2012/wordml" xmlns:w16cex="http://schemas.microsoft.com/office/word/2018/wordml/cex" xmlns:w16cid="http://schemas.microsoft.com/office/word/2016/wordml/cid" xmlns:w16="http://schemas.microsoft.com/office/word/2018/wordml" xmlns:w16du="http://schemas.microsoft.com/office/word/2023/wordml/word16du" xmlns:w16sdtdh="http://schemas.microsoft.com/office/word/2020/wordml/sdtdatahash" xmlns:w16sdtfl="http://schemas.microsoft.com/office/word/2024/wordml/sdtformatlock" xmlns:w16se="http://schemas.microsoft.com/office/word/2015/wordml/symex" mc:Ignorable="w14 w15 w16se w16cid w16 w16cex w16sdtdh w16sdtfl w16du">
+<w:styles xmlns:mc="http://schemas.openxmlformats.org/markup-compatibility/2006" xmlns:r="http://schemas.openxmlformats.org/officeDocument/2006/relationships" xmlns:w="http://schemas.openxmlformats.org/wordprocessingml/2006/main" xmlns:w14="http://schemas.microsoft.com/office/word/2010/wordml" xmlns:w15="http://schemas.microsoft.com/office/word/2012/wordml" xmlns:w16cex="http://schemas.microsoft.com/office/word/2018/wordml/cex" xmlns:w16cid="http://schemas.microsoft.com/office/word/2016/wordml/cid" xmlns:w16="http://schemas.microsoft.com/office/word/2018/wordml" xmlns:w16sdtdh="http://schemas.microsoft.com/office/word/2020/wordml/sdtdatahash" xmlns:w16se="http://schemas.microsoft.com/office/word/2015/wordml/symex" mc:Ignorable="w14 w15 w16se w16cid w16 w16cex w16sdtdh">
   <w:docDefaults>
     <w:rPrDefault>
       <w:rPr>
@@ -1983,39 +2044,39 @@
         <a:sysClr val="window" lastClr="FFFFFF"/>
       </a:lt1>
       <a:dk2>
-        <a:srgbClr val="0E2841"/>
+        <a:srgbClr val="44546A"/>
       </a:dk2>
       <a:lt2>
-        <a:srgbClr val="E8E8E8"/>
+        <a:srgbClr val="E7E6E6"/>
       </a:lt2>
       <a:accent1>
-        <a:srgbClr val="156082"/>
+        <a:srgbClr val="4472C4"/>
       </a:accent1>
       <a:accent2>
-        <a:srgbClr val="E97132"/>
+        <a:srgbClr val="ED7D31"/>
       </a:accent2>
       <a:accent3>
-        <a:srgbClr val="196B24"/>
+        <a:srgbClr val="A5A5A5"/>
       </a:accent3>
       <a:accent4>
-        <a:srgbClr val="0F9ED5"/>
+        <a:srgbClr val="FFC000"/>
       </a:accent4>
       <a:accent5>
-        <a:srgbClr val="A02B93"/>
+        <a:srgbClr val="5B9BD5"/>
       </a:accent5>
       <a:accent6>
-        <a:srgbClr val="4EA72E"/>
+        <a:srgbClr val="70AD47"/>
       </a:accent6>
       <a:hlink>
-        <a:srgbClr val="467886"/>
+        <a:srgbClr val="0563C1"/>
       </a:hlink>
       <a:folHlink>
-        <a:srgbClr val="96607D"/>
+        <a:srgbClr val="954F72"/>
       </a:folHlink>
     </a:clrScheme>
     <a:fontScheme name="Office">
       <a:majorFont>
-        <a:latin typeface="Aptos Display" panose="02110004020202020204"/>
+        <a:latin typeface="Calibri Light" panose="020F0302020204030204"/>
         <a:ea typeface=""/>
         <a:cs typeface=""/>
         <a:font script="Jpan" typeface="游ゴシック Light"/>
@@ -2067,7 +2128,7 @@
         <a:font script="Tfng" typeface="Ebrima"/>
       </a:majorFont>
       <a:minorFont>
-        <a:latin typeface="Aptos" panose="02110004020202020204"/>
+        <a:latin typeface="Calibri" panose="020F0502020204030204"/>
         <a:ea typeface=""/>
         <a:cs typeface=""/>
         <a:font script="Jpan" typeface="游明朝"/>
@@ -2178,6 +2239,13 @@
         </a:gradFill>
       </a:fillStyleLst>
       <a:lnStyleLst>
+        <a:ln w="6350" cap="flat" cmpd="sng" algn="ctr">
+          <a:solidFill>
+            <a:schemeClr val="phClr"/>
+          </a:solidFill>
+          <a:prstDash val="solid"/>
+          <a:miter lim="800000"/>
+        </a:ln>
         <a:ln w="12700" cap="flat" cmpd="sng" algn="ctr">
           <a:solidFill>
             <a:schemeClr val="phClr"/>
@@ -2186,13 +2254,6 @@
           <a:miter lim="800000"/>
         </a:ln>
         <a:ln w="19050" cap="flat" cmpd="sng" algn="ctr">
-          <a:solidFill>
-            <a:schemeClr val="phClr"/>
-          </a:solidFill>
-          <a:prstDash val="solid"/>
-          <a:miter lim="800000"/>
-        </a:ln>
-        <a:ln w="25400" cap="flat" cmpd="sng" algn="ctr">
           <a:solidFill>
             <a:schemeClr val="phClr"/>
           </a:solidFill>
@@ -2257,31 +2318,11 @@
       </a:bgFillStyleLst>
     </a:fmtScheme>
   </a:themeElements>
-  <a:objectDefaults>
-    <a:lnDef>
-      <a:spPr/>
-      <a:bodyPr/>
-      <a:lstStyle/>
-      <a:style>
-        <a:lnRef idx="2">
-          <a:schemeClr val="accent1"/>
-        </a:lnRef>
-        <a:fillRef idx="0">
-          <a:schemeClr val="accent1"/>
-        </a:fillRef>
-        <a:effectRef idx="1">
-          <a:schemeClr val="accent1"/>
-        </a:effectRef>
-        <a:fontRef idx="minor">
-          <a:schemeClr val="tx1"/>
-        </a:fontRef>
-      </a:style>
-    </a:lnDef>
-  </a:objectDefaults>
+  <a:objectDefaults/>
   <a:extraClrSchemeLst/>
   <a:extLst>
     <a:ext uri="{05A4C25C-085E-4340-85A3-A5531E510DB2}">
-      <thm15:themeFamily xmlns:thm15="http://schemas.microsoft.com/office/thememl/2012/main" name="Office Theme" id="{2E142A2C-CD16-42D6-873A-C26D2A0506FA}" vid="{1BDDFF52-6CD6-40A5-AB3C-68EB2F1E4D0A}"/>
+      <thm15:themeFamily xmlns:thm15="http://schemas.microsoft.com/office/thememl/2012/main" name="Office Theme" id="{62F939B6-93AF-4DB8-9C6B-D6C7DFDC589F}" vid="{4A3C46E8-61CC-4603-A589-7422A47A8E4A}"/>
     </a:ext>
   </a:extLst>
 </a:theme>

</xml_diff>